<commit_message>
drafting response to reviewers 2
</commit_message>
<xml_diff>
--- a/templates/template.docx
+++ b/templates/template.docx
@@ -773,6 +773,7 @@
       </w:footnotePr>
       <w:pgSz w:w="12240" w:h="15840"/>
       <w:pgMar w:top="1440" w:right="1440" w:bottom="1440" w:left="1440" w:header="720" w:footer="720" w:gutter="0"/>
+      <w:lnNumType w:countBy="1" w:restart="continuous"/>
       <w:cols w:space="720"/>
     </w:sectPr>
   </w:body>
@@ -2231,6 +2232,11 @@
       <w:sz w:val="22"/>
       <w:shd w:val="clear" w:color="auto" w:fill="F8F8F8"/>
     </w:rPr>
+  </w:style>
+  <w:style w:type="character" w:styleId="LineNumber">
+    <w:name w:val="line number"/>
+    <w:basedOn w:val="DefaultParagraphFont"/>
+    <w:rsid w:val="004E2847"/>
   </w:style>
 </w:styles>
 </file>

</xml_diff>